<commit_message>
Update BRCA NAS vs Bio-NAS outline with locked study decisions.
Set Adam Cankaya as author; BRCA-only multi-task TCGA stage and disease-status classification; spatio-temporal Intermediate Fusion; KEGG and Reactome Track B priors; and Docker-first reproducibility sections.
</commit_message>
<xml_diff>
--- a/Bio-NAS/papers/BRCA_TCGA_NAS_vs_Bio-NAS_IEEE_Outline.docx
+++ b/Bio-NAS/papers/BRCA_TCGA_NAS_vs_Bio-NAS_IEEE_Outline.docx
@@ -14,7 +14,7 @@
           <w:i w:val="0"/>
           <w:sz w:val="28"/>
         </w:rPr>
-        <w:t>Comparative Neural Architecture Search versus Biologically-Informed NAS for Multi-Omic Breast Cancer Prediction on TCGA-BRCA</w:t>
+        <w:t>Comparative Spatio-Temporal Neural Architecture Search versus Biologically-Informed NAS for Multi-Omic Classification on TCGA-BRCA</w:t>
       </w:r>
     </w:p>
     <w:p>
@@ -29,7 +29,7 @@
           <w:i w:val="0"/>
           <w:sz w:val="22"/>
         </w:rPr>
-        <w:t>[Author Name(s)]</w:t>
+        <w:t>Adam Cankaya</w:t>
       </w:r>
     </w:p>
     <w:p>
@@ -44,7 +44,7 @@
           <w:i/>
           <w:sz w:val="20"/>
         </w:rPr>
-        <w:t>[Affiliation(s), Department, Institution]</w:t>
+        <w:t>[Affiliation, Department, Institution — TBD]</w:t>
       </w:r>
     </w:p>
     <w:p>
@@ -88,7 +88,7 @@
           <w:i/>
           <w:sz w:val="18"/>
         </w:rPr>
-        <w:t>Document status: outline for peer-reviewed CS / computational biology journal submission. Placeholder summary lines (italic) indicate intended content; replace with full prose, equations, tables, and figures prior to submission. Formatting approximates IEEE journal manuscript prep (Times New Roman; numbered sections).</w:t>
+        <w:t>Document status: outline for peer-reviewed CS / computational biology journal submission. Placeholder summary lines (italic) indicate intended content; replace with full prose, equations, tables, and figures prior to submission. Formatting approximates IEEE journal manuscript prep (Times New Roman; numbered sections). Target venue TBD.</w:t>
       </w:r>
     </w:p>
     <w:p>
@@ -116,7 +116,7 @@
           <w:i w:val="0"/>
           <w:sz w:val="20"/>
         </w:rPr>
-        <w:t>Neural architecture search, biologically-informed deep learning, multi-omics, intermediate fusion, Optuna, TCGA-BRCA, breast invasive carcinoma, gene regulatory networks, pathway constraints, hyperparameter optimization.</w:t>
+        <w:t>Neural architecture search, biologically-informed deep learning, multi-omics, intermediate fusion, spatio-temporal learning, multi-task classification, Optuna, TCGA-BRCA, breast invasive carcinoma, tumor staging, KEGG, Reactome, Docker, hyperparameter optimization.</w:t>
       </w:r>
     </w:p>
     <w:p>
@@ -145,7 +145,7 @@
           <w:i/>
           <w:sz w:val="18"/>
         </w:rPr>
-        <w:t>[~150–250 words when written.] State the problem (unconstrained NAS vs biologically constrained search for multi-omic BRCA prediction), the dual-track design (Track A: standard NAS; Track B: Bio-NAS with KEGG/Reactome pathway constraints), the data (TCGA-BRCA methylation + RNA-seq via GDC), the method (Intermediate Fusion encoders, phased Optuna), key evaluation protocol (patient-level holdout, CV), and the intended contribution (whether biological priors improve accuracy, sparsity, and/or interpretability).</w:t>
+        <w:t>[~150–250 words when written.] BRCA-only study comparing unconstrained NAS (Track A) vs Bio-NAS (Track B; KEGG and Reactome pathway constraints) for multi-task classification of TCGA clinical labels—patient disease status (phenotype from sample_type) and AJCC pathologic tumor stage (severity). Methods use spatio-temporal multi-omic tensors, Intermediate Fusion, phased Optuna, patient-level holdout, and Docker-reproducible pipelines.</w:t>
       </w:r>
     </w:p>
     <w:p>
@@ -160,7 +160,7 @@
           <w:i w:val="0"/>
           <w:sz w:val="20"/>
         </w:rPr>
-        <w:t>Placeholder abstract: This paper presents a structured comparison of unconstrained Neural Architecture Search (NAS) and Biologically-Informed NAS (Bio-NAS) on The Cancer Genome Atlas Breast Invasive Carcinoma (TCGA-BRCA) cohort. … [complete after results.]</w:t>
+        <w:t>Placeholder abstract: This paper compares unconstrained Neural Architecture Search (NAS) and Biologically-Informed NAS (Bio-NAS) on The Cancer Genome Atlas Breast Invasive Carcinoma (TCGA-BRCA) cohort only. Using spatio-temporal multi-omic inputs (methylation and RNA-seq), we perform multi-task classification of disease status and tumor stage labels derived from TCGA clinical fields. … [complete after results.]</w:t>
       </w:r>
     </w:p>
     <w:p>
@@ -189,7 +189,7 @@
           <w:i/>
           <w:sz w:val="18"/>
         </w:rPr>
-        <w:t>Motivate multi-omic prediction in BRCA; limitations of hand-designed nets and early raw-concat fusion; introduce NAS and the Bio-NAS hypothesis; state contributions and paper organization.</w:t>
+        <w:t>Motivate BRCA multi-omic classification from TCGA labels; limitations of hand-designed nets and early raw-concat fusion; introduce spatio-temporal NAS vs Bio-NAS; state BRCA-only scope, contributions, and organization.</w:t>
       </w:r>
     </w:p>
     <w:p>
@@ -219,7 +219,23 @@
           <w:i w:val="0"/>
           <w:sz w:val="20"/>
         </w:rPr>
-        <w:t>Why BRCA is an appropriate anchor cohort for multi-omic NAS.</w:t>
+        <w:t>BRCA as the sole cohort for this manuscript (vertical-slice study).</w:t>
+      </w:r>
+    </w:p>
+    <w:p>
+      <w:pPr>
+        <w:pStyle w:val="ListBullet"/>
+        <w:spacing w:before="0" w:after="40" w:line="259" w:lineRule="auto"/>
+        <w:ind w:left="360"/>
+      </w:pPr>
+      <w:r>
+        <w:rPr>
+          <w:rFonts w:ascii="Times New Roman" w:hAnsi="Times New Roman" w:eastAsia="Times New Roman"/>
+          <w:b w:val="0"/>
+          <w:i w:val="0"/>
+          <w:sz w:val="20"/>
+        </w:rPr>
+        <w:t>Clinical classification targets aligned with TCGA fields: disease status and tumor stage.</w:t>
       </w:r>
     </w:p>
     <w:p>
@@ -251,7 +267,7 @@
           <w:i w:val="0"/>
           <w:sz w:val="20"/>
         </w:rPr>
-        <w:t>Need for reproducible, leakage-safe patient-level evaluation.</w:t>
+        <w:t>Need for reproducible, leakage-safe patient-level evaluation (Docker-first).</w:t>
       </w:r>
     </w:p>
     <w:p>
@@ -281,7 +297,7 @@
           <w:i w:val="0"/>
           <w:sz w:val="20"/>
         </w:rPr>
-        <w:t>Brief survey of NAS for tabular / omic settings (citations TBD).</w:t>
+        <w:t>Brief survey of NAS for tabular / omic / spatio-temporal settings (citations TBD).</w:t>
       </w:r>
     </w:p>
     <w:p>
@@ -327,7 +343,7 @@
           <w:i w:val="0"/>
           <w:sz w:val="20"/>
         </w:rPr>
-        <w:t>Gene regulatory / pathway graphs (KEGG, Reactome) as structural constraints.</w:t>
+        <w:t>Gene regulatory / pathway graphs from both KEGG and Reactome as Track B constraints.</w:t>
       </w:r>
     </w:p>
     <w:p>
@@ -343,7 +359,7 @@
           <w:i w:val="0"/>
           <w:sz w:val="20"/>
         </w:rPr>
-        <w:t>Hypothesis: Track B (Bio-NAS) improves generalization and interpretability vs Track A.</w:t>
+        <w:t>Hypothesis: Track B (Bio-NAS) improves generalization and/or interpretability vs Track A under matched spatio-temporal Intermediate Fusion and compute budget.</w:t>
       </w:r>
     </w:p>
     <w:p>
@@ -373,7 +389,7 @@
           <w:i w:val="0"/>
           <w:sz w:val="20"/>
         </w:rPr>
-        <w:t>Formal dual-track A/B comparison protocol on TCGA-BRCA (shared data splits).</w:t>
+        <w:t>BRCA-only dual-track A/B protocol for multi-task TCGA label classification (disease status + AJCC pathologic tumor stage).</w:t>
       </w:r>
     </w:p>
     <w:p>
@@ -389,7 +405,7 @@
           <w:i w:val="0"/>
           <w:sz w:val="20"/>
         </w:rPr>
-        <w:t>Intermediate Fusion multi-branch architecture search space (MethEncoder, RNAEncoder, FusionDecoder).</w:t>
+        <w:t>Spatio-temporal Intermediate Fusion search space (MethEncoder, RNAEncoder, temporal modules, FusionDecoder).</w:t>
       </w:r>
     </w:p>
     <w:p>
@@ -405,7 +421,7 @@
           <w:i w:val="0"/>
           <w:sz w:val="20"/>
         </w:rPr>
-        <w:t>Phased Optuna search (branch HPs → post-fusion dense) with distributed study storage.</w:t>
+        <w:t>Phased Optuna search with Track B masks from KEGG and Reactome; distributed study storage.</w:t>
       </w:r>
     </w:p>
     <w:p>
@@ -421,7 +437,7 @@
           <w:i w:val="0"/>
           <w:sz w:val="20"/>
         </w:rPr>
-        <w:t>Empirical evaluation design: holdout metrics, sparsity/interpretability proxies, ablations.</w:t>
+        <w:t>Docker-reproducible data and experiment workflow for open-access GDC/TCGA artifacts.</w:t>
       </w:r>
     </w:p>
     <w:p>
@@ -478,7 +494,7 @@
           <w:i/>
           <w:sz w:val="18"/>
         </w:rPr>
-        <w:t>Position against prior multi-omic fusion, NAS, and biology-informed DL papers.</w:t>
+        <w:t>Position against prior multi-omic fusion, staging/phenotype classifiers, NAS, and biology-informed DL on TCGA-BRCA.</w:t>
       </w:r>
     </w:p>
     <w:p>
@@ -524,7 +540,7 @@
           <w:i w:val="0"/>
           <w:sz w:val="20"/>
         </w:rPr>
-        <w:t>Prior BRCA / TCGA multi-omic models (citations TBD).</w:t>
+        <w:t>Prior BRCA / TCGA multi-omic classification models (citations TBD).</w:t>
       </w:r>
     </w:p>
     <w:p>
@@ -538,7 +554,53 @@
           <w:i w:val="0"/>
           <w:sz w:val="20"/>
         </w:rPr>
-        <w:t>B. Neural Architecture Search for Healthcare and Genomics</w:t>
+        <w:t>B. Spatio-Temporal Deep Learning for Genomics</w:t>
+      </w:r>
+    </w:p>
+    <w:p>
+      <w:pPr>
+        <w:pStyle w:val="ListBullet"/>
+        <w:spacing w:before="0" w:after="40" w:line="259" w:lineRule="auto"/>
+        <w:ind w:left="360"/>
+      </w:pPr>
+      <w:r>
+        <w:rPr>
+          <w:rFonts w:ascii="Times New Roman" w:hAnsi="Times New Roman" w:eastAsia="Times New Roman"/>
+          <w:b w:val="0"/>
+          <w:i w:val="0"/>
+          <w:sz w:val="20"/>
+        </w:rPr>
+        <w:t>Spatial genomic structure (CpG/gene neighborhoods, chromosomal spacing).</w:t>
+      </w:r>
+    </w:p>
+    <w:p>
+      <w:pPr>
+        <w:pStyle w:val="ListBullet"/>
+        <w:spacing w:before="0" w:after="40" w:line="259" w:lineRule="auto"/>
+        <w:ind w:left="360"/>
+      </w:pPr>
+      <w:r>
+        <w:rPr>
+          <w:rFonts w:ascii="Times New Roman" w:hAnsi="Times New Roman" w:eastAsia="Times New Roman"/>
+          <w:b w:val="0"/>
+          <w:i w:val="0"/>
+          <w:sz w:val="20"/>
+        </w:rPr>
+        <w:t>Temporal / longitudinal progression and irregular Δt modeling.</w:t>
+      </w:r>
+    </w:p>
+    <w:p>
+      <w:pPr>
+        <w:spacing w:before="200" w:after="80" w:line="259" w:lineRule="auto"/>
+      </w:pPr>
+      <w:r>
+        <w:rPr>
+          <w:rFonts w:ascii="Times New Roman" w:hAnsi="Times New Roman" w:eastAsia="Times New Roman"/>
+          <w:b/>
+          <w:i w:val="0"/>
+          <w:sz w:val="20"/>
+        </w:rPr>
+        <w:t>C. Neural Architecture Search for Healthcare and Genomics</w:t>
       </w:r>
     </w:p>
     <w:p>
@@ -584,7 +646,7 @@
           <w:i w:val="0"/>
           <w:sz w:val="20"/>
         </w:rPr>
-        <w:t>C. Biologically Constrained Neural Networks</w:t>
+        <w:t>D. Biologically Constrained Neural Networks</w:t>
       </w:r>
     </w:p>
     <w:p>
@@ -600,7 +662,7 @@
           <w:i w:val="0"/>
           <w:sz w:val="20"/>
         </w:rPr>
-        <w:t>Pathway-masked layers, GRN-informed connectivity, sparse biological priors.</w:t>
+        <w:t>Pathway-masked layers; priors from KEGG and Reactome.</w:t>
       </w:r>
     </w:p>
     <w:p>
@@ -616,7 +678,7 @@
           <w:i w:val="0"/>
           <w:sz w:val="20"/>
         </w:rPr>
-        <w:t>Gap: controlled A/B of unconstrained vs pathway-constrained NAS under identical fusion and data.</w:t>
+        <w:t>Gap: controlled A/B of unconstrained vs pathway-constrained NAS under identical spatio-temporal fusion, labels, and BRCA cohort.</w:t>
       </w:r>
     </w:p>
     <w:p>
@@ -645,7 +707,7 @@
           <w:i/>
           <w:sz w:val="18"/>
         </w:rPr>
-        <w:t>Define terms precisely so reviewers can distinguish Track A (control) from Track B (innovation) without conflating fusion strategy with biological constraints.</w:t>
+        <w:t>Define Track A (control) vs Track B (innovation) without conflating Intermediate Fusion or spatio-temporal modules with biological constraints.</w:t>
       </w:r>
     </w:p>
     <w:p>
@@ -675,7 +737,7 @@
           <w:i w:val="0"/>
           <w:sz w:val="20"/>
         </w:rPr>
-        <w:t>Search space over encoder widths/depths, activations, regularization, fusion head HPs.</w:t>
+        <w:t>Search over spatial/temporal encoder families, widths/depths, regularization, fusion heads.</w:t>
       </w:r>
     </w:p>
     <w:p>
@@ -691,7 +753,7 @@
           <w:i w:val="0"/>
           <w:sz w:val="20"/>
         </w:rPr>
-        <w:t>No pathway adjacency mask; connectivity learned freely within module families.</w:t>
+        <w:t>No pathway adjacency mask; connectivity free within module families.</w:t>
       </w:r>
     </w:p>
     <w:p>
@@ -705,7 +767,7 @@
           <w:i/>
           <w:sz w:val="18"/>
         </w:rPr>
-        <w:t>Summary: Track A optimizes predictive performance under Intermediate Fusion without biological graph constraints.</w:t>
+        <w:t>Summary: Track A optimizes multi-task classification performance without biological graph constraints.</w:t>
       </w:r>
     </w:p>
     <w:p>
@@ -735,7 +797,7 @@
           <w:i w:val="0"/>
           <w:sz w:val="20"/>
         </w:rPr>
-        <w:t>Same fusion scaffold as Track A; additional KEGG/Reactome-derived adjacency / pathway masks.</w:t>
+        <w:t>Same spatio-temporal Intermediate Fusion scaffold as Track A.</w:t>
       </w:r>
     </w:p>
     <w:p>
@@ -751,7 +813,23 @@
           <w:i w:val="0"/>
           <w:sz w:val="20"/>
         </w:rPr>
-        <w:t>Constraints applied to spatial / branch modules (frozen mask construction; dual-track Optuna).</w:t>
+        <w:t>Pathway / adjacency masks constructed from both KEGG and Reactome (compare and/or union strategies — detail in Methods).</w:t>
+      </w:r>
+    </w:p>
+    <w:p>
+      <w:pPr>
+        <w:pStyle w:val="ListBullet"/>
+        <w:spacing w:before="0" w:after="40" w:line="259" w:lineRule="auto"/>
+        <w:ind w:left="360"/>
+      </w:pPr>
+      <w:r>
+        <w:rPr>
+          <w:rFonts w:ascii="Times New Roman" w:hAnsi="Times New Roman" w:eastAsia="Times New Roman"/>
+          <w:b w:val="0"/>
+          <w:i w:val="0"/>
+          <w:sz w:val="20"/>
+        </w:rPr>
+        <w:t>Constraints applied to spatial / branch modules; frozen mask construction; dual-track Optuna.</w:t>
       </w:r>
     </w:p>
     <w:p>
@@ -765,7 +843,7 @@
           <w:i/>
           <w:sz w:val="18"/>
         </w:rPr>
-        <w:t>Summary: Bio-NAS restricts or biases architecture choices using prior molecular network knowledge.</w:t>
+        <w:t>Summary: Bio-NAS restricts or biases architecture choices using prior molecular network knowledge from KEGG and Reactome.</w:t>
       </w:r>
     </w:p>
     <w:p>
@@ -795,7 +873,7 @@
           <w:i w:val="0"/>
           <w:sz w:val="20"/>
         </w:rPr>
-        <w:t>Shared cohort, preprocessing, Intermediate Fusion topology family, CV folds, and compute budget.</w:t>
+        <w:t>Shared BRCA cohort, preprocessing, Intermediate Fusion family, CV folds, and compute budget.</w:t>
       </w:r>
     </w:p>
     <w:p>
@@ -811,7 +889,7 @@
           <w:i w:val="0"/>
           <w:sz w:val="20"/>
         </w:rPr>
-        <w:t>Differ only in biological constraint track (A vs B).</w:t>
+        <w:t>Differ in biological constraint track (A vs B) and pathway-source variants.</w:t>
       </w:r>
     </w:p>
     <w:p>
@@ -827,7 +905,7 @@
           <w:i w:val="0"/>
           <w:sz w:val="20"/>
         </w:rPr>
-        <w:t>Primary and secondary endpoints (accuracy/AUROC/AUPRC; sparsity; attribution stability).</w:t>
+        <w:t>Endpoints: multi-task classification metrics (accuracy/AUROC/AUPRC/macro-F1 per head); sparsity; attribution stability.</w:t>
       </w:r>
     </w:p>
     <w:p>
@@ -847,6 +925,20 @@
     </w:p>
     <w:p>
       <w:pPr>
+        <w:spacing w:before="0" w:after="160" w:line="259" w:lineRule="auto"/>
+      </w:pPr>
+      <w:r>
+        <w:rPr>
+          <w:rFonts w:ascii="Times New Roman" w:hAnsi="Times New Roman" w:eastAsia="Times New Roman"/>
+          <w:b w:val="0"/>
+          <w:i/>
+          <w:sz w:val="18"/>
+        </w:rPr>
+        <w:t>This manuscript is BRCA-only. No non-BRCA cohorts are evaluated here.</w:t>
+      </w:r>
+    </w:p>
+    <w:p>
+      <w:pPr>
         <w:spacing w:before="200" w:after="80" w:line="259" w:lineRule="auto"/>
       </w:pPr>
       <w:r>
@@ -872,7 +964,7 @@
           <w:i w:val="0"/>
           <w:sz w:val="20"/>
         </w:rPr>
-        <w:t>Project: TCGA Breast Invasive Carcinoma (TCGA-BRCA).</w:t>
+        <w:t>Project: TCGA Breast Invasive Carcinoma (TCGA-BRCA) exclusively.</w:t>
       </w:r>
     </w:p>
     <w:p>
@@ -904,7 +996,7 @@
           <w:i w:val="0"/>
           <w:sz w:val="20"/>
         </w:rPr>
-        <w:t>Controlled-access BAM/raw noted as out of scope unless required.</w:t>
+        <w:t>Controlled-access BAM/raw out of scope unless explicitly required later.</w:t>
       </w:r>
     </w:p>
     <w:p>
@@ -932,7 +1024,7 @@
           <w:i w:val="0"/>
           <w:sz w:val="20"/>
         </w:rPr>
-        <w:t>B. Multi-Omic Modalities</w:t>
+        <w:t>B. Multi-Omic Modalities and Spatio-Temporal Representation</w:t>
       </w:r>
     </w:p>
     <w:p>
@@ -980,7 +1072,23 @@
           <w:i w:val="0"/>
           <w:sz w:val="20"/>
         </w:rPr>
-        <w:t>Optional clinical covariates / phenotype and severity labels from disease registry.</w:t>
+        <w:t>Spatial axis: genomic / CpG / gene structural spacing and neighborhood structure.</w:t>
+      </w:r>
+    </w:p>
+    <w:p>
+      <w:pPr>
+        <w:pStyle w:val="ListBullet"/>
+        <w:spacing w:before="0" w:after="40" w:line="259" w:lineRule="auto"/>
+        <w:ind w:left="360"/>
+      </w:pPr>
+      <w:r>
+        <w:rPr>
+          <w:rFonts w:ascii="Times New Roman" w:hAnsi="Times New Roman" w:eastAsia="Times New Roman"/>
+          <w:b w:val="0"/>
+          <w:i w:val="0"/>
+          <w:sz w:val="20"/>
+        </w:rPr>
+        <w:t>Temporal axis: longitudinal visit structure, primary/recurrent matching, irregular Δt embedding where available.</w:t>
       </w:r>
     </w:p>
     <w:p>
@@ -994,7 +1102,7 @@
           <w:i/>
           <w:sz w:val="18"/>
         </w:rPr>
-        <w:t>Summary: Specify feature spaces, units, and modality-specific scaling rules.</w:t>
+        <w:t>Summary: Construct 4D (or equivalent) spatio-temporal tensors for Intermediate Fusion loaders; BRCA feature-map and spacing configs as specified in the Bio-NAS plans.</w:t>
       </w:r>
     </w:p>
     <w:p>
@@ -1008,7 +1116,7 @@
           <w:i w:val="0"/>
           <w:sz w:val="20"/>
         </w:rPr>
-        <w:t>C. Cohort Filtering, Matching, and Longitudinal Considerations</w:t>
+        <w:t>C. Classification Targets from TCGA Clinical Fields</w:t>
       </w:r>
     </w:p>
     <w:p>
@@ -1024,7 +1132,7 @@
           <w:i w:val="0"/>
           <w:sz w:val="20"/>
         </w:rPr>
-        <w:t>Case inclusion/exclusion; primary vs recurrent matching if used.</w:t>
+        <w:t>Primary tasks are supervised classification using TCGA-provided clinical labels (multi-task learning).</w:t>
       </w:r>
     </w:p>
     <w:p>
@@ -1040,7 +1148,55 @@
           <w:i w:val="0"/>
           <w:sz w:val="20"/>
         </w:rPr>
-        <w:t>Irregular time steps and Δt embedding (if in scope for this paper).</w:t>
+        <w:t>Disease status / phenotype head: from TCGA sample_type (e.g., Solid Tissue Normal → 0; Primary/Metastatic/Recurrent Tumor → 1).</w:t>
+      </w:r>
+    </w:p>
+    <w:p>
+      <w:pPr>
+        <w:pStyle w:val="ListBullet"/>
+        <w:spacing w:before="0" w:after="40" w:line="259" w:lineRule="auto"/>
+        <w:ind w:left="360"/>
+      </w:pPr>
+      <w:r>
+        <w:rPr>
+          <w:rFonts w:ascii="Times New Roman" w:hAnsi="Times New Roman" w:eastAsia="Times New Roman"/>
+          <w:b w:val="0"/>
+          <w:i w:val="0"/>
+          <w:sz w:val="20"/>
+        </w:rPr>
+        <w:t>Tumor stage / severity head: from ajcc_pathologic_tumor_stage (Stage I/IA/IB → 0; II/IIA/IIB → 1; III/IIIA/IIIB/IIIC → 2; IV → 3).</w:t>
+      </w:r>
+    </w:p>
+    <w:p>
+      <w:pPr>
+        <w:pStyle w:val="ListBullet"/>
+        <w:spacing w:before="0" w:after="40" w:line="259" w:lineRule="auto"/>
+        <w:ind w:left="360"/>
+      </w:pPr>
+      <w:r>
+        <w:rPr>
+          <w:rFonts w:ascii="Times New Roman" w:hAnsi="Times New Roman" w:eastAsia="Times New Roman"/>
+          <w:b w:val="0"/>
+          <w:i w:val="0"/>
+          <w:sz w:val="20"/>
+        </w:rPr>
+        <w:t>Missing severity policy: mask (e.g., severity = −1 for normal samples without stage).</w:t>
+      </w:r>
+    </w:p>
+    <w:p>
+      <w:pPr>
+        <w:pStyle w:val="ListBullet"/>
+        <w:spacing w:before="0" w:after="40" w:line="259" w:lineRule="auto"/>
+        <w:ind w:left="360"/>
+      </w:pPr>
+      <w:r>
+        <w:rPr>
+          <w:rFonts w:ascii="Times New Roman" w:hAnsi="Times New Roman" w:eastAsia="Times New Roman"/>
+          <w:b w:val="0"/>
+          <w:i w:val="0"/>
+          <w:sz w:val="20"/>
+        </w:rPr>
+        <w:t>Additional TCGA clinical classification labels may be added if consistently available; stage + disease status are the minimum reported task set.</w:t>
       </w:r>
     </w:p>
     <w:p>
@@ -1054,7 +1210,7 @@
           <w:i/>
           <w:sz w:val="18"/>
         </w:rPr>
-        <w:t>Summary: State whether this manuscript is static multi-omic, longitudinal, or both.</w:t>
+        <w:t>Summary: Align label definitions with the project disease registry for BRCA; report class balances and missingness.</w:t>
       </w:r>
     </w:p>
     <w:p>
@@ -1068,7 +1224,69 @@
           <w:i w:val="0"/>
           <w:sz w:val="20"/>
         </w:rPr>
-        <w:t>D. Train / Validation / Holdout Splits</w:t>
+        <w:t>D. Cohort Filtering and Longitudinal Matching</w:t>
+      </w:r>
+    </w:p>
+    <w:p>
+      <w:pPr>
+        <w:pStyle w:val="ListBullet"/>
+        <w:spacing w:before="0" w:after="40" w:line="259" w:lineRule="auto"/>
+        <w:ind w:left="360"/>
+      </w:pPr>
+      <w:r>
+        <w:rPr>
+          <w:rFonts w:ascii="Times New Roman" w:hAnsi="Times New Roman" w:eastAsia="Times New Roman"/>
+          <w:b w:val="0"/>
+          <w:i w:val="0"/>
+          <w:sz w:val="20"/>
+        </w:rPr>
+        <w:t>Case inclusion/exclusion rules for BRCA.</w:t>
+      </w:r>
+    </w:p>
+    <w:p>
+      <w:pPr>
+        <w:pStyle w:val="ListBullet"/>
+        <w:spacing w:before="0" w:after="40" w:line="259" w:lineRule="auto"/>
+        <w:ind w:left="360"/>
+      </w:pPr>
+      <w:r>
+        <w:rPr>
+          <w:rFonts w:ascii="Times New Roman" w:hAnsi="Times New Roman" w:eastAsia="Times New Roman"/>
+          <w:b w:val="0"/>
+          <w:i w:val="0"/>
+          <w:sz w:val="20"/>
+        </w:rPr>
+        <w:t>Primary vs recurrent (or multi-timepoint) matching for temporal modeling.</w:t>
+      </w:r>
+    </w:p>
+    <w:p>
+      <w:pPr>
+        <w:pStyle w:val="ListBullet"/>
+        <w:spacing w:before="0" w:after="40" w:line="259" w:lineRule="auto"/>
+        <w:ind w:left="360"/>
+      </w:pPr>
+      <w:r>
+        <w:rPr>
+          <w:rFonts w:ascii="Times New Roman" w:hAnsi="Times New Roman" w:eastAsia="Times New Roman"/>
+          <w:b w:val="0"/>
+          <w:i w:val="0"/>
+          <w:sz w:val="20"/>
+        </w:rPr>
+        <w:t>Irregular time-step handling and Δt features.</w:t>
+      </w:r>
+    </w:p>
+    <w:p>
+      <w:pPr>
+        <w:spacing w:before="200" w:after="80" w:line="259" w:lineRule="auto"/>
+      </w:pPr>
+      <w:r>
+        <w:rPr>
+          <w:rFonts w:ascii="Times New Roman" w:hAnsi="Times New Roman" w:eastAsia="Times New Roman"/>
+          <w:b/>
+          <w:i w:val="0"/>
+          <w:sz w:val="20"/>
+        </w:rPr>
+        <w:t>E. Train / Validation / Holdout Splits</w:t>
       </w:r>
     </w:p>
     <w:p>
@@ -1144,7 +1362,7 @@
           <w:i w:val="0"/>
           <w:sz w:val="20"/>
         </w:rPr>
-        <w:t>E. Storage Layout and Reproducibility Artifacts</w:t>
+        <w:t>F. Storage Layout and Reproducibility Artifacts</w:t>
       </w:r>
     </w:p>
     <w:p>
@@ -1160,7 +1378,7 @@
           <w:i w:val="0"/>
           <w:sz w:val="20"/>
         </w:rPr>
-        <w:t>HDF5 / tensor serialization for Intermediate Fusion batches (meth_tensor, rna_tensor, labels).</w:t>
+        <w:t>HDF5 / tensor serialization for Intermediate Fusion batches (methylation_tensor, rna_tensor, labels, temporal fields).</w:t>
       </w:r>
     </w:p>
     <w:p>
@@ -1181,22 +1399,6 @@
     </w:p>
     <w:p>
       <w:pPr>
-        <w:pStyle w:val="ListBullet"/>
-        <w:spacing w:before="0" w:after="40" w:line="259" w:lineRule="auto"/>
-        <w:ind w:left="360"/>
-      </w:pPr>
-      <w:r>
-        <w:rPr>
-          <w:rFonts w:ascii="Times New Roman" w:hAnsi="Times New Roman" w:eastAsia="Times New Roman"/>
-          <w:b w:val="0"/>
-          <w:i w:val="0"/>
-          <w:sz w:val="20"/>
-        </w:rPr>
-        <w:t>Containerized reproduction path (Docker Compose) for open-access sample workflows.</w:t>
-      </w:r>
-    </w:p>
-    <w:p>
-      <w:pPr>
         <w:spacing w:before="240" w:after="120" w:line="259" w:lineRule="auto"/>
         <w:jc w:val="center"/>
       </w:pPr>
@@ -1221,7 +1423,7 @@
           <w:i/>
           <w:sz w:val="18"/>
         </w:rPr>
-        <w:t>Core technical section: architecture families, fusion, search, training, evaluation.</w:t>
+        <w:t>Core technical section: multi-task formulation, spatio-temporal modules, fusion, Optuna, Docker reproducibility, evaluation.</w:t>
       </w:r>
     </w:p>
     <w:p>
@@ -1235,7 +1437,7 @@
           <w:i w:val="0"/>
           <w:sz w:val="20"/>
         </w:rPr>
-        <w:t>A. Problem Formulation</w:t>
+        <w:t>A. Problem Formulation (Multi-Task Classification)</w:t>
       </w:r>
     </w:p>
     <w:p>
@@ -1251,7 +1453,7 @@
           <w:i w:val="0"/>
           <w:sz w:val="20"/>
         </w:rPr>
-        <w:t>Input: multi-omic patient sample (x_meth, x_rna[, covariates]).</w:t>
+        <w:t>Input: spatio-temporal multi-omic sample (x_meth, x_rna[, Δt / visit context]).</w:t>
       </w:r>
     </w:p>
     <w:p>
@@ -1267,7 +1469,7 @@
           <w:i w:val="0"/>
           <w:sz w:val="20"/>
         </w:rPr>
-        <w:t>Output: phenotype / severity / survival or MTL heads (specify final task).</w:t>
+        <w:t>Outputs: (i) disease-status / phenotype class; (ii) AJCC pathologic tumor-stage class; shared trunk with task-specific heads (MTL).</w:t>
       </w:r>
     </w:p>
     <w:p>
@@ -1283,7 +1485,7 @@
           <w:i w:val="0"/>
           <w:sz w:val="20"/>
         </w:rPr>
-        <w:t>Objective: maximize validation metric under Track A or Track B constraints.</w:t>
+        <w:t>Objective: maximize joint validation classification performance under Track A or Track B constraints (state loss weighting).</w:t>
       </w:r>
     </w:p>
     <w:p>
@@ -1327,7 +1529,7 @@
           <w:i w:val="0"/>
           <w:sz w:val="20"/>
         </w:rPr>
-        <w:t>Candidate blocks: MLP / spatial CNN / transformer variants (as implemented).</w:t>
+        <w:t>Spatial CNN / transformer / MLP candidates over CpG structure.</w:t>
       </w:r>
     </w:p>
     <w:p>
@@ -1403,7 +1605,7 @@
           <w:i/>
           <w:sz w:val="20"/>
         </w:rPr>
-        <w:t>3) Fusion Decoder (FusionDecoder)</w:t>
+        <w:t>3) Temporal Progression Modules</w:t>
       </w:r>
     </w:p>
     <w:p>
@@ -1419,7 +1621,7 @@
           <w:i w:val="0"/>
           <w:sz w:val="20"/>
         </w:rPr>
-        <w:t>Post-concatenation dense tower → task head(s).</w:t>
+        <w:t>Modules consuming visit order / Δt for longitudinal BRCA samples.</w:t>
       </w:r>
     </w:p>
     <w:p>
@@ -1435,7 +1637,7 @@
           <w:i w:val="0"/>
           <w:sz w:val="20"/>
         </w:rPr>
-        <w:t>MTL loss design if multi-task (cite losses module).</w:t>
+        <w:t>Searchable temporal HPs (recurrent, attention, or Δt-embedding variants).</w:t>
       </w:r>
     </w:p>
     <w:p>
@@ -1449,7 +1651,7 @@
           <w:i/>
           <w:sz w:val="20"/>
         </w:rPr>
-        <w:t>4) Track B Pathway / Adjacency Constraints</w:t>
+        <w:t>4) Fusion Decoder and Classification Heads (FusionDecoder)</w:t>
       </w:r>
     </w:p>
     <w:p>
@@ -1465,7 +1667,7 @@
           <w:i w:val="0"/>
           <w:sz w:val="20"/>
         </w:rPr>
-        <w:t>Construction and freeze of biological masks from pathway databases.</w:t>
+        <w:t>Post-concatenation dense tower → phenotype head + stage head.</w:t>
       </w:r>
     </w:p>
     <w:p>
@@ -1481,7 +1683,69 @@
           <w:i w:val="0"/>
           <w:sz w:val="20"/>
         </w:rPr>
-        <w:t>How masks alter searchable connectivity vs Track A.</w:t>
+        <w:t>MTL losses with masking for missing stage labels.</w:t>
+      </w:r>
+    </w:p>
+    <w:p>
+      <w:pPr>
+        <w:spacing w:before="160" w:after="60" w:line="259" w:lineRule="auto"/>
+      </w:pPr>
+      <w:r>
+        <w:rPr>
+          <w:rFonts w:ascii="Times New Roman" w:hAnsi="Times New Roman" w:eastAsia="Times New Roman"/>
+          <w:b/>
+          <w:i/>
+          <w:sz w:val="20"/>
+        </w:rPr>
+        <w:t>5) Track B Pathway / Adjacency Constraints (KEGG and Reactome)</w:t>
+      </w:r>
+    </w:p>
+    <w:p>
+      <w:pPr>
+        <w:pStyle w:val="ListBullet"/>
+        <w:spacing w:before="0" w:after="40" w:line="259" w:lineRule="auto"/>
+        <w:ind w:left="360"/>
+      </w:pPr>
+      <w:r>
+        <w:rPr>
+          <w:rFonts w:ascii="Times New Roman" w:hAnsi="Times New Roman" w:eastAsia="Times New Roman"/>
+          <w:b w:val="0"/>
+          <w:i w:val="0"/>
+          <w:sz w:val="20"/>
+        </w:rPr>
+        <w:t>Build and freeze adjacency / pathway masks from KEGG.</w:t>
+      </w:r>
+    </w:p>
+    <w:p>
+      <w:pPr>
+        <w:pStyle w:val="ListBullet"/>
+        <w:spacing w:before="0" w:after="40" w:line="259" w:lineRule="auto"/>
+        <w:ind w:left="360"/>
+      </w:pPr>
+      <w:r>
+        <w:rPr>
+          <w:rFonts w:ascii="Times New Roman" w:hAnsi="Times New Roman" w:eastAsia="Times New Roman"/>
+          <w:b w:val="0"/>
+          <w:i w:val="0"/>
+          <w:sz w:val="20"/>
+        </w:rPr>
+        <w:t>Build and freeze adjacency / pathway masks from Reactome.</w:t>
+      </w:r>
+    </w:p>
+    <w:p>
+      <w:pPr>
+        <w:pStyle w:val="ListBullet"/>
+        <w:spacing w:before="0" w:after="40" w:line="259" w:lineRule="auto"/>
+        <w:ind w:left="360"/>
+      </w:pPr>
+      <w:r>
+        <w:rPr>
+          <w:rFonts w:ascii="Times New Roman" w:hAnsi="Times New Roman" w:eastAsia="Times New Roman"/>
+          <w:b w:val="0"/>
+          <w:i w:val="0"/>
+          <w:sz w:val="20"/>
+        </w:rPr>
+        <w:t>Report how each source (and any combined mask) alters searchable connectivity vs Track A.</w:t>
       </w:r>
     </w:p>
     <w:p>
@@ -1511,7 +1775,7 @@
           <w:i w:val="0"/>
           <w:sz w:val="20"/>
         </w:rPr>
-        <w:t>Branch-specific encoding → latent concatenation → post-fusion dense.</w:t>
+        <w:t>Branch-specific encoding → latent concatenation → post-fusion dense → MTL heads.</w:t>
       </w:r>
     </w:p>
     <w:p>
@@ -1527,7 +1791,7 @@
           <w:i w:val="0"/>
           <w:sz w:val="20"/>
         </w:rPr>
-        <w:t>Rationale vs early raw-concat (legacy baseline) and late stacked fusion (ADR path).</w:t>
+        <w:t>Rationale vs early raw-concat (legacy) and late stacked fusion (optional baseline; TBD).</w:t>
       </w:r>
     </w:p>
     <w:p>
@@ -1543,7 +1807,7 @@
           <w:i w:val="0"/>
           <w:sz w:val="20"/>
         </w:rPr>
-        <w:t>Diagram placeholder: Fig. 1 — Intermediate Fusion NAS scaffold.</w:t>
+        <w:t>Diagram placeholder: Fig. 1 — Spatio-temporal Intermediate Fusion NAS scaffold.</w:t>
       </w:r>
     </w:p>
     <w:p>
@@ -1557,7 +1821,7 @@
           <w:i/>
           <w:sz w:val="18"/>
         </w:rPr>
-        <w:t>Summary: Intermediate Fusion is the default NAS architecture; early fusion retained only as a legacy software baseline, not as the primary search target.</w:t>
+        <w:t>Summary: Intermediate Fusion is the default NAS architecture; early fusion retained only as a possible legacy software baseline (inclusion TBD).</w:t>
       </w:r>
     </w:p>
     <w:p>
@@ -1601,7 +1865,7 @@
           <w:i w:val="0"/>
           <w:sz w:val="20"/>
         </w:rPr>
-        <w:t>Categorical and continuous parameters for branches and decoder.</w:t>
+        <w:t>Categorical and continuous parameters for spatial, temporal, and decoder modules.</w:t>
       </w:r>
     </w:p>
     <w:p>
@@ -1617,7 +1881,7 @@
           <w:i w:val="0"/>
           <w:sz w:val="20"/>
         </w:rPr>
-        <w:t>Track A vs Track B parameter differences (mask on/off or mask-related choices).</w:t>
+        <w:t>Track A vs Track B differences (KEGG/Reactome mask variants).</w:t>
       </w:r>
     </w:p>
     <w:p>
@@ -1647,7 +1911,7 @@
           <w:i w:val="0"/>
           <w:sz w:val="20"/>
         </w:rPr>
-        <w:t>Phase A: optimize branch HPs (encoders) independently / with frozen decoder policy.</w:t>
+        <w:t>Phase A: optimize branch / temporal HPs (encoders).</w:t>
       </w:r>
     </w:p>
     <w:p>
@@ -1663,7 +1927,7 @@
           <w:i w:val="0"/>
           <w:sz w:val="20"/>
         </w:rPr>
-        <w:t>Phase B: freeze selected branch configs; optimize post-fusion dense only.</w:t>
+        <w:t>Phase B: freeze selected branch configs; optimize post-fusion dense + heads.</w:t>
       </w:r>
     </w:p>
     <w:p>
@@ -1753,7 +2017,7 @@
           <w:i w:val="0"/>
           <w:sz w:val="20"/>
         </w:rPr>
-        <w:t>CV metric (e.g., mean AUROC / loss); pruner feedback.</w:t>
+        <w:t>CV multi-task classification metric (e.g., mean AUROC / macro-F1 across heads, with masked stage samples handled correctly).</w:t>
       </w:r>
     </w:p>
     <w:p>
@@ -1815,7 +2079,7 @@
           <w:i w:val="0"/>
           <w:sz w:val="20"/>
         </w:rPr>
-        <w:t>Losses for classification / regression / Cox / MTL (as applicable).</w:t>
+        <w:t>MTL classification losses with severity masking.</w:t>
       </w:r>
     </w:p>
     <w:p>
@@ -1831,7 +2095,7 @@
           <w:i w:val="0"/>
           <w:sz w:val="20"/>
         </w:rPr>
-        <w:t>Hardware and software stack (PyTorch, CUDA, container image pins).</w:t>
+        <w:t>Hardware and software stack (PyTorch, CUDA, pinned container image).</w:t>
       </w:r>
     </w:p>
     <w:p>
@@ -1845,7 +2109,21 @@
           <w:i w:val="0"/>
           <w:sz w:val="20"/>
         </w:rPr>
-        <w:t>F. Baselines and Ablations</w:t>
+        <w:t>F. Docker-First Reproducible Workflow</w:t>
+      </w:r>
+    </w:p>
+    <w:p>
+      <w:pPr>
+        <w:spacing w:before="0" w:after="160" w:line="259" w:lineRule="auto"/>
+      </w:pPr>
+      <w:r>
+        <w:rPr>
+          <w:rFonts w:ascii="Times New Roman" w:hAnsi="Times New Roman" w:eastAsia="Times New Roman"/>
+          <w:b w:val="0"/>
+          <w:i/>
+          <w:sz w:val="18"/>
+        </w:rPr>
+        <w:t>Executable experiment paths are designed to run inside the Bio-NAS Docker container (docker/Dockerfile, docker-compose.yml), not as host-only workflows.</w:t>
       </w:r>
     </w:p>
     <w:p>
@@ -1861,7 +2139,7 @@
           <w:i w:val="0"/>
           <w:sz w:val="20"/>
         </w:rPr>
-        <w:t>Legacy early-fusion model (raw concat) as non-NAS or fixed-architecture reference.</w:t>
+        <w:t>Compose contract: from Bio-NAS/, docker compose up --build builds the image, optionally downloads open-access TCGA-BRCA sample data via GDC API on first run, and invokes container entrypoint scripts.</w:t>
       </w:r>
     </w:p>
     <w:p>
@@ -1877,7 +2155,7 @@
           <w:i w:val="0"/>
           <w:sz w:val="20"/>
         </w:rPr>
-        <w:t>Classical ML baselines (e.g., ElasticNet / stacking late fusion) if in scope.</w:t>
+        <w:t>Host bind mount: ./data/tcga → /data/tcga (cohort outputs under /data/tcga/BRCA).</w:t>
       </w:r>
     </w:p>
     <w:p>
@@ -1893,7 +2171,39 @@
           <w:i w:val="0"/>
           <w:sz w:val="20"/>
         </w:rPr>
-        <w:t>Ablations: spatial-only vs spatio-temporal; Track A vs B; fusion variants.</w:t>
+        <w:t>Dependencies pinned in docker/requirements.txt; scripts extended via scripts/docker_entrypoint.py and related container-invoked tools.</w:t>
+      </w:r>
+    </w:p>
+    <w:p>
+      <w:pPr>
+        <w:pStyle w:val="ListBullet"/>
+        <w:spacing w:before="0" w:after="40" w:line="259" w:lineRule="auto"/>
+        <w:ind w:left="360"/>
+      </w:pPr>
+      <w:r>
+        <w:rPr>
+          <w:rFonts w:ascii="Times New Roman" w:hAnsi="Times New Roman" w:eastAsia="Times New Roman"/>
+          <w:b w:val="0"/>
+          <w:i w:val="0"/>
+          <w:sz w:val="20"/>
+        </w:rPr>
+        <w:t>Full-cohort ETL / Optuna workers remain Docker-oriented; interactive DUA / controlled-access credential steps (if any) are documented as out-of-container exceptions.</w:t>
+      </w:r>
+    </w:p>
+    <w:p>
+      <w:pPr>
+        <w:pStyle w:val="ListBullet"/>
+        <w:spacing w:before="0" w:after="40" w:line="259" w:lineRule="auto"/>
+        <w:ind w:left="360"/>
+      </w:pPr>
+      <w:r>
+        <w:rPr>
+          <w:rFonts w:ascii="Times New Roman" w:hAnsi="Times New Roman" w:eastAsia="Times New Roman"/>
+          <w:b w:val="0"/>
+          <w:i w:val="0"/>
+          <w:sz w:val="20"/>
+        </w:rPr>
+        <w:t>Reference: Bio-NAS/docker/README.md for the current compose contract and expected artifacts (manifest.json, demographics, experiment outputs).</w:t>
       </w:r>
     </w:p>
     <w:p>
@@ -1907,7 +2217,7 @@
           <w:i w:val="0"/>
           <w:sz w:val="20"/>
         </w:rPr>
-        <w:t>G. Evaluation Protocol</w:t>
+        <w:t>G. Baselines and Ablations (TBD)</w:t>
       </w:r>
     </w:p>
     <w:p>
@@ -1923,7 +2233,7 @@
           <w:i w:val="0"/>
           <w:sz w:val="20"/>
         </w:rPr>
-        <w:t>Locked patient holdout; report point estimates + uncertainty.</w:t>
+        <w:t>Baseline set not finalized: candidates include legacy early fusion, classical ML / late stacking, spatial-only vs spatio-temporal ablations.</w:t>
       </w:r>
     </w:p>
     <w:p>
@@ -1939,7 +2249,7 @@
           <w:i w:val="0"/>
           <w:sz w:val="20"/>
         </w:rPr>
-        <w:t>Calibration, confusion matrices, survival metrics if applicable.</w:t>
+        <w:t>Required ablation: Track A vs Track B; KEGG vs Reactome (vs combined) masks.</w:t>
       </w:r>
     </w:p>
     <w:p>
@@ -1955,7 +2265,69 @@
           <w:i w:val="0"/>
           <w:sz w:val="20"/>
         </w:rPr>
-        <w:t>Interpretability: attribution / pathway enrichment for Track B.</w:t>
+        <w:t>Finalize baseline table before experiments freeze.</w:t>
+      </w:r>
+    </w:p>
+    <w:p>
+      <w:pPr>
+        <w:spacing w:before="200" w:after="80" w:line="259" w:lineRule="auto"/>
+      </w:pPr>
+      <w:r>
+        <w:rPr>
+          <w:rFonts w:ascii="Times New Roman" w:hAnsi="Times New Roman" w:eastAsia="Times New Roman"/>
+          <w:b/>
+          <w:i w:val="0"/>
+          <w:sz w:val="20"/>
+        </w:rPr>
+        <w:t>H. Evaluation Protocol</w:t>
+      </w:r>
+    </w:p>
+    <w:p>
+      <w:pPr>
+        <w:pStyle w:val="ListBullet"/>
+        <w:spacing w:before="0" w:after="40" w:line="259" w:lineRule="auto"/>
+        <w:ind w:left="360"/>
+      </w:pPr>
+      <w:r>
+        <w:rPr>
+          <w:rFonts w:ascii="Times New Roman" w:hAnsi="Times New Roman" w:eastAsia="Times New Roman"/>
+          <w:b w:val="0"/>
+          <w:i w:val="0"/>
+          <w:sz w:val="20"/>
+        </w:rPr>
+        <w:t>Locked patient holdout; per-head and joint classification metrics + CIs.</w:t>
+      </w:r>
+    </w:p>
+    <w:p>
+      <w:pPr>
+        <w:pStyle w:val="ListBullet"/>
+        <w:spacing w:before="0" w:after="40" w:line="259" w:lineRule="auto"/>
+        <w:ind w:left="360"/>
+      </w:pPr>
+      <w:r>
+        <w:rPr>
+          <w:rFonts w:ascii="Times New Roman" w:hAnsi="Times New Roman" w:eastAsia="Times New Roman"/>
+          <w:b w:val="0"/>
+          <w:i w:val="0"/>
+          <w:sz w:val="20"/>
+        </w:rPr>
+        <w:t>Confusion matrices / calibration for phenotype and stage heads.</w:t>
+      </w:r>
+    </w:p>
+    <w:p>
+      <w:pPr>
+        <w:pStyle w:val="ListBullet"/>
+        <w:spacing w:before="0" w:after="40" w:line="259" w:lineRule="auto"/>
+        <w:ind w:left="360"/>
+      </w:pPr>
+      <w:r>
+        <w:rPr>
+          <w:rFonts w:ascii="Times New Roman" w:hAnsi="Times New Roman" w:eastAsia="Times New Roman"/>
+          <w:b w:val="0"/>
+          <w:i w:val="0"/>
+          <w:sz w:val="20"/>
+        </w:rPr>
+        <w:t>Interpretability: attribution / pathway enrichment for Track B (KEGG &amp; Reactome).</w:t>
       </w:r>
     </w:p>
     <w:p>
@@ -2000,7 +2372,7 @@
           <w:i/>
           <w:sz w:val="18"/>
         </w:rPr>
-        <w:t>Concrete settings reviewers need to reproduce: tables of HPs, budgets, seeds.</w:t>
+        <w:t>Concrete settings reviewers need to reproduce: tables of HPs, budgets, seeds, Docker image tags.</w:t>
       </w:r>
     </w:p>
     <w:p>
@@ -2030,7 +2402,7 @@
           <w:i w:val="0"/>
           <w:sz w:val="20"/>
         </w:rPr>
-        <w:t>Code repository, container image, dependency pins.</w:t>
+        <w:t>Code repository (PhDNeural / Bio-NAS), container image tag, dependency pins.</w:t>
       </w:r>
     </w:p>
     <w:p>
@@ -2051,6 +2423,22 @@
     </w:p>
     <w:p>
       <w:pPr>
+        <w:pStyle w:val="ListBullet"/>
+        <w:spacing w:before="0" w:after="40" w:line="259" w:lineRule="auto"/>
+        <w:ind w:left="360"/>
+      </w:pPr>
+      <w:r>
+        <w:rPr>
+          <w:rFonts w:ascii="Times New Roman" w:hAnsi="Times New Roman" w:eastAsia="Times New Roman"/>
+          <w:b w:val="0"/>
+          <w:i w:val="0"/>
+          <w:sz w:val="20"/>
+        </w:rPr>
+        <w:t>Document exact docker compose / entrypoint commands used for reported runs.</w:t>
+      </w:r>
+    </w:p>
+    <w:p>
+      <w:pPr>
         <w:spacing w:before="200" w:after="80" w:line="259" w:lineRule="auto"/>
       </w:pPr>
       <w:r>
@@ -2152,7 +2540,23 @@
           <w:i w:val="0"/>
           <w:sz w:val="20"/>
         </w:rPr>
-        <w:t>Primary metric; secondary metrics; significance thresholds.</w:t>
+        <w:t>Primary: holdout multi-task classification performance (state aggregation across heads).</w:t>
+      </w:r>
+    </w:p>
+    <w:p>
+      <w:pPr>
+        <w:pStyle w:val="ListBullet"/>
+        <w:spacing w:before="0" w:after="40" w:line="259" w:lineRule="auto"/>
+        <w:ind w:left="360"/>
+      </w:pPr>
+      <w:r>
+        <w:rPr>
+          <w:rFonts w:ascii="Times New Roman" w:hAnsi="Times New Roman" w:eastAsia="Times New Roman"/>
+          <w:b w:val="0"/>
+          <w:i w:val="0"/>
+          <w:sz w:val="20"/>
+        </w:rPr>
+        <w:t>Secondary: per-head metrics, sparsity, pathway attribution overlap, runtime.</w:t>
       </w:r>
     </w:p>
     <w:p>
@@ -2195,7 +2599,7 @@
           <w:i w:val="0"/>
           <w:sz w:val="20"/>
         </w:rPr>
-        <w:t>A. Cohort and Feature Statistics</w:t>
+        <w:t>A. Cohort and Label Statistics</w:t>
       </w:r>
     </w:p>
     <w:p>
@@ -2211,7 +2615,7 @@
           <w:i w:val="0"/>
           <w:sz w:val="20"/>
         </w:rPr>
-        <w:t>Table/figure: sample counts, modality coverage, class balance.</w:t>
+        <w:t>Table/figure: BRCA sample counts, modality coverage, phenotype and stage class balances, missing stage rates.</w:t>
       </w:r>
     </w:p>
     <w:p>
@@ -2241,7 +2645,7 @@
           <w:i w:val="0"/>
           <w:sz w:val="20"/>
         </w:rPr>
-        <w:t>Optuna optimization curves; best trial architectures for Tracks A and B.</w:t>
+        <w:t>Optuna curves; best Trial A vs B architectures (and KEGG/Reactome variants).</w:t>
       </w:r>
     </w:p>
     <w:p>
@@ -2271,7 +2675,7 @@
           <w:i w:val="0"/>
           <w:sz w:val="20"/>
         </w:rPr>
-        <w:t>C. Predictive Performance: Track A (NAS) vs Track B (Bio-NAS)</w:t>
+        <w:t>C. Classification Performance: Track A (NAS) vs Track B (Bio-NAS)</w:t>
       </w:r>
     </w:p>
     <w:p>
@@ -2287,7 +2691,7 @@
           <w:i w:val="0"/>
           <w:sz w:val="20"/>
         </w:rPr>
-        <w:t>CV and holdout tables; confidence intervals.</w:t>
+        <w:t>CV and holdout tables for phenotype and stage heads; confidence intervals.</w:t>
       </w:r>
     </w:p>
     <w:p>
@@ -2333,7 +2737,23 @@
           <w:i w:val="0"/>
           <w:sz w:val="20"/>
         </w:rPr>
-        <w:t>Fusion strategy ablations; module family ablations; constraint strength.</w:t>
+        <w:t>Spatial-only vs spatio-temporal; pathway source (KEGG / Reactome / both).</w:t>
+      </w:r>
+    </w:p>
+    <w:p>
+      <w:pPr>
+        <w:pStyle w:val="ListBullet"/>
+        <w:spacing w:before="0" w:after="40" w:line="259" w:lineRule="auto"/>
+        <w:ind w:left="360"/>
+      </w:pPr>
+      <w:r>
+        <w:rPr>
+          <w:rFonts w:ascii="Times New Roman" w:hAnsi="Times New Roman" w:eastAsia="Times New Roman"/>
+          <w:b w:val="0"/>
+          <w:i w:val="0"/>
+          <w:sz w:val="20"/>
+        </w:rPr>
+        <w:t>Fusion / baseline ablations as finalized in Section V-G.</w:t>
       </w:r>
     </w:p>
     <w:p>
@@ -2393,7 +2813,7 @@
           <w:i w:val="0"/>
           <w:sz w:val="20"/>
         </w:rPr>
-        <w:t>Pathway-level attributions; overlap with known BRCA biology (qualitative + quantitative).</w:t>
+        <w:t>Pathway-level attributions vs known BRCA biology; compare KEGG- vs Reactome-guided models.</w:t>
       </w:r>
     </w:p>
     <w:p>
@@ -2436,7 +2856,7 @@
           <w:i/>
           <w:sz w:val="18"/>
         </w:rPr>
-        <w:t>Discuss whether biological priors helped, hurt, or traded accuracy for interpretability.</w:t>
+        <w:t>Discuss whether biological priors helped phenotype classification, stage classification, both, or traded accuracy for interpretability.</w:t>
       </w:r>
     </w:p>
     <w:p>
@@ -2450,7 +2870,7 @@
           <w:i w:val="0"/>
           <w:sz w:val="20"/>
         </w:rPr>
-        <w:t>B. Intermediate Fusion Design Choices</w:t>
+        <w:t>B. Spatio-Temporal and Intermediate Fusion Design Choices</w:t>
       </w:r>
     </w:p>
     <w:p>
@@ -2464,7 +2884,7 @@
           <w:i/>
           <w:sz w:val="18"/>
         </w:rPr>
-        <w:t>Reflect on modality imbalance, latent sizes, and phased Optuna effectiveness.</w:t>
+        <w:t>Reflect on temporal signal strength in BRCA, modality imbalance, and phased Optuna effectiveness.</w:t>
       </w:r>
     </w:p>
     <w:p>
@@ -2494,7 +2914,7 @@
           <w:i w:val="0"/>
           <w:sz w:val="20"/>
         </w:rPr>
-        <w:t>Cohort biases (TCGA clinical demographics); open-access Level-3 limits.</w:t>
+        <w:t>BRCA-only scope; no cross-disease claims in this paper.</w:t>
       </w:r>
     </w:p>
     <w:p>
@@ -2510,7 +2930,7 @@
           <w:i w:val="0"/>
           <w:sz w:val="20"/>
         </w:rPr>
-        <w:t>Incomplete pathway coverage; mask construction assumptions.</w:t>
+        <w:t>TCGA clinical label noise / staging incompleteness; open-access Level-3 limits.</w:t>
       </w:r>
     </w:p>
     <w:p>
@@ -2526,7 +2946,7 @@
           <w:i w:val="0"/>
           <w:sz w:val="20"/>
         </w:rPr>
-        <w:t>Search budget and stochasticity of NAS.</w:t>
+        <w:t>Incomplete pathway coverage; KEGG vs Reactome mapping disagreements.</w:t>
       </w:r>
     </w:p>
     <w:p>
@@ -2542,7 +2962,7 @@
           <w:i w:val="0"/>
           <w:sz w:val="20"/>
         </w:rPr>
-        <w:t>Generalization beyond BRCA not claimed in this manuscript (unless included).</w:t>
+        <w:t>Search budget and stochasticity of NAS; baseline set may evolve.</w:t>
       </w:r>
     </w:p>
     <w:p>
@@ -2588,7 +3008,7 @@
           <w:i w:val="0"/>
           <w:sz w:val="20"/>
         </w:rPr>
-        <w:t>External: other cancers / non-TCGA cohorts.</w:t>
+        <w:t>External: other cancers / non-TCGA cohorts (future work).</w:t>
       </w:r>
     </w:p>
     <w:p>
@@ -2604,7 +3024,7 @@
           <w:i w:val="0"/>
           <w:sz w:val="20"/>
         </w:rPr>
-        <w:t>Construct: whether chosen metrics capture clinical utility.</w:t>
+        <w:t>Construct: whether stage/phenotype metrics capture clinical utility.</w:t>
       </w:r>
     </w:p>
     <w:p>
@@ -2618,7 +3038,7 @@
           <w:i w:val="0"/>
           <w:sz w:val="20"/>
         </w:rPr>
-        <w:t>E. Implications for Practice and Future Multi-Disease Extension</w:t>
+        <w:t>E. Implications and Future Multi-Disease Extension</w:t>
       </w:r>
     </w:p>
     <w:p>
@@ -2632,7 +3052,7 @@
           <w:i/>
           <w:sz w:val="18"/>
         </w:rPr>
-        <w:t>Bridge to broader Bio-NAS thesis agenda (additional pathologies) without overclaiming.</w:t>
+        <w:t>Bridge to broader Bio-NAS thesis agenda without overclaiming beyond BRCA results.</w:t>
       </w:r>
     </w:p>
     <w:p>
@@ -2661,7 +3081,7 @@
           <w:i/>
           <w:sz w:val="18"/>
         </w:rPr>
-        <w:t>Restate problem, dual-track method, main empirical takeaway (TBD), and contribution to CS/AutoML + computational oncology. Avoid introducing new results.</w:t>
+        <w:t>Restate BRCA-only multi-task classification problem, dual-track spatio-temporal method, main empirical takeaway (TBD), and contribution. Avoid new results.</w:t>
       </w:r>
     </w:p>
     <w:p>
@@ -2676,7 +3096,7 @@
           <w:i w:val="0"/>
           <w:sz w:val="20"/>
         </w:rPr>
-        <w:t>Placeholder conclusion: We outlined and will report a controlled comparison of unconstrained NAS and Bio-NAS for Intermediate Fusion multi-omic learning on TCGA-BRCA. …</w:t>
+        <w:t>Placeholder conclusion: We will report a controlled comparison of unconstrained NAS and Bio-NAS (KEGG and Reactome) for spatio-temporal Intermediate Fusion multi-task classification of TCGA-BRCA disease status and tumor stage. …</w:t>
       </w:r>
     </w:p>
     <w:p>
@@ -2705,7 +3125,7 @@
           <w:i/>
           <w:sz w:val="18"/>
         </w:rPr>
-        <w:t>Optional short executive wrap-up for readers skimming after the conclusion: 5–8 sentences recapping data, Intermediate Fusion, Optuna phasing, Track A vs B, and take-home message. If the target journal disallows a separate Summary, merge into Conclusion or Abstract.</w:t>
+        <w:t>Short executive wrap-up. If the eventual venue disallows a separate Summary, merge into Conclusion or Abstract (venue TBD).</w:t>
       </w:r>
     </w:p>
     <w:p>
@@ -2721,7 +3141,7 @@
           <w:i w:val="0"/>
           <w:sz w:val="20"/>
         </w:rPr>
-        <w:t>Data: TCGA-BRCA multi-omics (methylation + RNA) from GDC.</w:t>
+        <w:t>Cohort: TCGA-BRCA only (GDC open-access multi-omics).</w:t>
       </w:r>
     </w:p>
     <w:p>
@@ -2737,7 +3157,7 @@
           <w:i w:val="0"/>
           <w:sz w:val="20"/>
         </w:rPr>
-        <w:t>Method: Intermediate Fusion encoders + FusionDecoder; phased Optuna.</w:t>
+        <w:t>Tasks: classify disease status (phenotype) and AJCC pathologic tumor stage (severity).</w:t>
       </w:r>
     </w:p>
     <w:p>
@@ -2753,7 +3173,7 @@
           <w:i w:val="0"/>
           <w:sz w:val="20"/>
         </w:rPr>
-        <w:t>Comparison: Track A (NAS) vs Track B (Bio-NAS pathway constraints).</w:t>
+        <w:t>Inputs: spatial + temporal multi-omic tensors; Intermediate Fusion.</w:t>
       </w:r>
     </w:p>
     <w:p>
@@ -2769,7 +3189,23 @@
           <w:i w:val="0"/>
           <w:sz w:val="20"/>
         </w:rPr>
-        <w:t>Evaluation: patient-level holdout + CV; performance and interpretability.</w:t>
+        <w:t>Search: phased Optuna; Track A (NAS) vs Track B (Bio-NAS; KEGG + Reactome).</w:t>
+      </w:r>
+    </w:p>
+    <w:p>
+      <w:pPr>
+        <w:pStyle w:val="ListBullet"/>
+        <w:spacing w:before="0" w:after="40" w:line="259" w:lineRule="auto"/>
+        <w:ind w:left="360"/>
+      </w:pPr>
+      <w:r>
+        <w:rPr>
+          <w:rFonts w:ascii="Times New Roman" w:hAnsi="Times New Roman" w:eastAsia="Times New Roman"/>
+          <w:b w:val="0"/>
+          <w:i w:val="0"/>
+          <w:sz w:val="20"/>
+        </w:rPr>
+        <w:t>Reproducibility: Docker Compose / pinned container workflow.</w:t>
       </w:r>
     </w:p>
     <w:p>
@@ -2843,7 +3279,7 @@
           <w:i/>
           <w:sz w:val="18"/>
         </w:rPr>
-        <w:t>IEEE numbered citation list. Seed topics: NAS surveys; Optuna; multi-omic fusion; TCGA-BRCA; KEGG/Reactome; Hyperband; related Bio-NAS / pathway-informed DL.</w:t>
+        <w:t>IEEE numbered citation list. Seed topics: NAS surveys; Optuna; multi-omic fusion; spatio-temporal genomics; TCGA-BRCA staging; KEGG; Reactome; Hyperband; Docker reproducibility; pathway-informed DL.</w:t>
       </w:r>
     </w:p>
     <w:p>
@@ -2914,7 +3350,7 @@
           <w:i/>
           <w:sz w:val="18"/>
         </w:rPr>
-        <w:t>Full Optuna parameter catalogs for Track A and Track B.</w:t>
+        <w:t>Full Optuna parameter catalogs for Track A and Track B (KEGG / Reactome).</w:t>
       </w:r>
     </w:p>
     <w:p>
@@ -2929,7 +3365,7 @@
           <w:i w:val="0"/>
           <w:sz w:val="20"/>
         </w:rPr>
-        <w:t>APPENDIX B — ADDITIONAL COHORT AND PREPROCESSING DETAILS</w:t>
+        <w:t>APPENDIX B — ADDITIONAL COHORT, LABEL, AND PREPROCESSING DETAILS</w:t>
       </w:r>
     </w:p>
     <w:p>
@@ -2943,7 +3379,7 @@
           <w:i/>
           <w:sz w:val="18"/>
         </w:rPr>
-        <w:t>GDC query filters, QC plots, missingness handling.</w:t>
+        <w:t>GDC query filters; phenotype/stage mapping tables; QC plots; missingness handling.</w:t>
       </w:r>
     </w:p>
     <w:p>
@@ -2958,7 +3394,36 @@
           <w:i w:val="0"/>
           <w:sz w:val="20"/>
         </w:rPr>
-        <w:t>APPENDIX C — SUPPLEMENTARY RESULTS</w:t>
+        <w:t>APPENDIX C — DOCKER REPRODUCTION COMMANDS</w:t>
+      </w:r>
+    </w:p>
+    <w:p>
+      <w:pPr>
+        <w:spacing w:before="0" w:after="160" w:line="259" w:lineRule="auto"/>
+      </w:pPr>
+      <w:r>
+        <w:rPr>
+          <w:rFonts w:ascii="Times New Roman" w:hAnsi="Times New Roman" w:eastAsia="Times New Roman"/>
+          <w:b w:val="0"/>
+          <w:i/>
+          <w:sz w:val="18"/>
+        </w:rPr>
+        <w:t>Exact compose/build/run commands, volume mounts, image tags, and expected host-path outputs for reported experiments.</w:t>
+      </w:r>
+    </w:p>
+    <w:p>
+      <w:pPr>
+        <w:spacing w:before="240" w:after="120" w:line="259" w:lineRule="auto"/>
+        <w:jc w:val="center"/>
+      </w:pPr>
+      <w:r>
+        <w:rPr>
+          <w:rFonts w:ascii="Times New Roman" w:hAnsi="Times New Roman" w:eastAsia="Times New Roman"/>
+          <w:b/>
+          <w:i w:val="0"/>
+          <w:sz w:val="20"/>
+        </w:rPr>
+        <w:t>APPENDIX D — SUPPLEMENTARY RESULTS</w:t>
       </w:r>
     </w:p>
     <w:p>
@@ -3003,7 +3468,7 @@
           <w:i w:val="0"/>
           <w:sz w:val="20"/>
         </w:rPr>
-        <w:t>Fig. 1: Intermediate Fusion architecture (Track A vs Track B overlay).</w:t>
+        <w:t>Fig. 1: Spatio-temporal Intermediate Fusion (Track A vs Track B overlay).</w:t>
       </w:r>
     </w:p>
     <w:p>
@@ -3035,7 +3500,7 @@
           <w:i w:val="0"/>
           <w:sz w:val="20"/>
         </w:rPr>
-        <w:t>Fig. 3: Holdout performance comparison (NAS vs Bio-NAS).</w:t>
+        <w:t>Fig. 3: Holdout classification performance (phenotype + stage; NAS vs Bio-NAS).</w:t>
       </w:r>
     </w:p>
     <w:p>
@@ -3051,7 +3516,7 @@
           <w:i w:val="0"/>
           <w:sz w:val="20"/>
         </w:rPr>
-        <w:t>Fig. 4: Ablation / sparsity / pathway attribution panel.</w:t>
+        <w:t>Fig. 4: Ablation / sparsity / KEGG–Reactome attribution panel.</w:t>
       </w:r>
     </w:p>
     <w:p>
@@ -3067,7 +3532,7 @@
           <w:i w:val="0"/>
           <w:sz w:val="20"/>
         </w:rPr>
-        <w:t>Table I: Cohort and modality statistics.</w:t>
+        <w:t>Table I: BRCA cohort, modality, and label statistics.</w:t>
       </w:r>
     </w:p>
     <w:p>
@@ -3099,7 +3564,7 @@
           <w:i w:val="0"/>
           <w:sz w:val="20"/>
         </w:rPr>
-        <w:t>Table III: Compute budget and selected hyperparameters.</w:t>
+        <w:t>Table III: Compute budget, Docker image tag, selected hyperparameters.</w:t>
       </w:r>
     </w:p>
     <w:p>
@@ -3115,7 +3580,7 @@
           <w:i w:val="0"/>
           <w:sz w:val="20"/>
         </w:rPr>
-        <w:t>Table IV: Main results (CV + holdout).</w:t>
+        <w:t>Table IV: Main classification results (CV + holdout).</w:t>
       </w:r>
     </w:p>
     <w:p>
@@ -3131,7 +3596,7 @@
           <w:i w:val="0"/>
           <w:sz w:val="20"/>
         </w:rPr>
-        <w:t>Table V: Ablations and baselines.</w:t>
+        <w:t>Table V: Ablations and baselines (finalize when baseline set is chosen).</w:t>
       </w:r>
     </w:p>
     <w:p>
@@ -3146,7 +3611,7 @@
           <w:i w:val="0"/>
           <w:sz w:val="20"/>
         </w:rPr>
-        <w:t>AUTHOR NOTES — CLARIFYING QUESTIONS FOR OUTLINE REFINEMENT</w:t>
+        <w:t>AUTHOR NOTES — LOCKED MANUSCRIPT DECISIONS</w:t>
       </w:r>
     </w:p>
     <w:p>
@@ -3160,12 +3625,14 @@
           <w:i/>
           <w:sz w:val="18"/>
         </w:rPr>
-        <w:t>These questions are for the author (not for the journal). Resolve before drafting full prose.</w:t>
+        <w:t>Decisions captured for drafting; remaining open items listed last.</w:t>
       </w:r>
     </w:p>
     <w:p>
       <w:pPr>
-        <w:spacing w:before="0" w:after="60" w:line="259" w:lineRule="auto"/>
+        <w:pStyle w:val="ListBullet"/>
+        <w:spacing w:before="0" w:after="40" w:line="259" w:lineRule="auto"/>
+        <w:ind w:left="360"/>
       </w:pPr>
       <w:r>
         <w:rPr>
@@ -3174,12 +3641,14 @@
           <w:i w:val="0"/>
           <w:sz w:val="20"/>
         </w:rPr>
-        <w:t>1. Primary prediction task: subtype classification, severity/stage, survival (Cox), multi-task, or other?</w:t>
+        <w:t>Author: Adam Cankaya.</w:t>
       </w:r>
     </w:p>
     <w:p>
       <w:pPr>
-        <w:spacing w:before="0" w:after="60" w:line="259" w:lineRule="auto"/>
+        <w:pStyle w:val="ListBullet"/>
+        <w:spacing w:before="0" w:after="40" w:line="259" w:lineRule="auto"/>
+        <w:ind w:left="360"/>
       </w:pPr>
       <w:r>
         <w:rPr>
@@ -3188,12 +3657,14 @@
           <w:i w:val="0"/>
           <w:sz w:val="20"/>
         </w:rPr>
-        <w:t>2. Scope of this paper: BRCA-only vertical slice, or include any non-BRCA cohorts?</w:t>
+        <w:t>Primary tasks: multi-task classification of TCGA clinical labels — disease status (phenotype / sample_type) and AJCC pathologic tumor stage (severity).</w:t>
       </w:r>
     </w:p>
     <w:p>
       <w:pPr>
-        <w:spacing w:before="0" w:after="60" w:line="259" w:lineRule="auto"/>
+        <w:pStyle w:val="ListBullet"/>
+        <w:spacing w:before="0" w:after="40" w:line="259" w:lineRule="auto"/>
+        <w:ind w:left="360"/>
       </w:pPr>
       <w:r>
         <w:rPr>
@@ -3202,12 +3673,14 @@
           <w:i w:val="0"/>
           <w:sz w:val="20"/>
         </w:rPr>
-        <w:t>3. Temporal scope: static multi-omic only, or include longitudinal / Δt modules in this manuscript?</w:t>
+        <w:t>Cohort scope: BRCA only.</w:t>
       </w:r>
     </w:p>
     <w:p>
       <w:pPr>
-        <w:spacing w:before="0" w:after="60" w:line="259" w:lineRule="auto"/>
+        <w:pStyle w:val="ListBullet"/>
+        <w:spacing w:before="0" w:after="40" w:line="259" w:lineRule="auto"/>
+        <w:ind w:left="360"/>
       </w:pPr>
       <w:r>
         <w:rPr>
@@ -3216,12 +3689,14 @@
           <w:i w:val="0"/>
           <w:sz w:val="20"/>
         </w:rPr>
-        <w:t>4. Must early-fusion and late-stacking baselines appear as first-class comparisons, or appendix-only?</w:t>
+        <w:t>Data dimensionality: spatial and temporal.</w:t>
       </w:r>
     </w:p>
     <w:p>
       <w:pPr>
-        <w:spacing w:before="0" w:after="60" w:line="259" w:lineRule="auto"/>
+        <w:pStyle w:val="ListBullet"/>
+        <w:spacing w:before="0" w:after="40" w:line="259" w:lineRule="auto"/>
+        <w:ind w:left="360"/>
       </w:pPr>
       <w:r>
         <w:rPr>
@@ -3230,12 +3705,14 @@
           <w:i w:val="0"/>
           <w:sz w:val="20"/>
         </w:rPr>
-        <w:t>5. Target venue (IEEE TCBB, JBHI, TNNLS, NeurIPS workshop, etc.) — affects Summary section and page limits?</w:t>
+        <w:t>Track B pathway sources: both KEGG and Reactome.</w:t>
       </w:r>
     </w:p>
     <w:p>
       <w:pPr>
-        <w:spacing w:before="0" w:after="60" w:line="259" w:lineRule="auto"/>
+        <w:pStyle w:val="ListBullet"/>
+        <w:spacing w:before="0" w:after="40" w:line="259" w:lineRule="auto"/>
+        <w:ind w:left="360"/>
       </w:pPr>
       <w:r>
         <w:rPr>
@@ -3244,12 +3721,14 @@
           <w:i w:val="0"/>
           <w:sz w:val="20"/>
         </w:rPr>
-        <w:t>6. Author list, affiliations, and corresponding author?</w:t>
+        <w:t>Reproducibility: Docker-first workflow documented in Methods + Appendix C.</w:t>
       </w:r>
     </w:p>
     <w:p>
       <w:pPr>
-        <w:spacing w:before="0" w:after="60" w:line="259" w:lineRule="auto"/>
+        <w:pStyle w:val="ListBullet"/>
+        <w:spacing w:before="0" w:after="40" w:line="259" w:lineRule="auto"/>
+        <w:ind w:left="360"/>
       </w:pPr>
       <w:r>
         <w:rPr>
@@ -3258,12 +3737,14 @@
           <w:i w:val="0"/>
           <w:sz w:val="20"/>
         </w:rPr>
-        <w:t>7. Working title preferences (shorter conference-style vs longer journal-style)?</w:t>
+        <w:t>Open: baselines set (early fusion / classical / late stacking) — TBD.</w:t>
       </w:r>
     </w:p>
     <w:p>
       <w:pPr>
-        <w:spacing w:before="0" w:after="60" w:line="259" w:lineRule="auto"/>
+        <w:pStyle w:val="ListBullet"/>
+        <w:spacing w:before="0" w:after="40" w:line="259" w:lineRule="auto"/>
+        <w:ind w:left="360"/>
       </w:pPr>
       <w:r>
         <w:rPr>
@@ -3272,12 +3753,14 @@
           <w:i w:val="0"/>
           <w:sz w:val="20"/>
         </w:rPr>
-        <w:t>8. Which pathway databases are authoritative for Track B in this paper (KEGG, Reactome, both)?</w:t>
+        <w:t>Open: target venue / whether separate Summary section is retained — TBD.</w:t>
       </w:r>
     </w:p>
     <w:p>
       <w:pPr>
-        <w:spacing w:before="0" w:after="60" w:line="259" w:lineRule="auto"/>
+        <w:pStyle w:val="ListBullet"/>
+        <w:spacing w:before="0" w:after="40" w:line="259" w:lineRule="auto"/>
+        <w:ind w:left="360"/>
       </w:pPr>
       <w:r>
         <w:rPr>
@@ -3286,21 +3769,7 @@
           <w:i w:val="0"/>
           <w:sz w:val="20"/>
         </w:rPr>
-        <w:t>9. Will Docker/reproducibility be a Methods subsection or a short Availability statement only?</w:t>
-      </w:r>
-    </w:p>
-    <w:p>
-      <w:pPr>
-        <w:spacing w:before="0" w:after="60" w:line="259" w:lineRule="auto"/>
-      </w:pPr>
-      <w:r>
-        <w:rPr>
-          <w:rFonts w:ascii="Times New Roman" w:hAnsi="Times New Roman" w:eastAsia="Times New Roman"/>
-          <w:b w:val="0"/>
-          <w:i w:val="0"/>
-          <w:sz w:val="20"/>
-        </w:rPr>
-        <w:t>10. Any results embargo or committee constraints on what may appear in a preprint?</w:t>
+        <w:t>Open: affiliation block and corresponding email — TBD.</w:t>
       </w:r>
     </w:p>
     <w:sectPr>

</xml_diff>